<commit_message>
v4.2: Rueckmeldung Pietro umgesetzt (E16) — QR nur auf S. 3, «Quelle» statt «Pflichtquelle», Schreibfelder fuellen die Seiten, Vertiefungskarten mit Antwortfeld
Exporte in docs/upgrade-v4.2/gold erneuert; Gates, Messung und Bestandsvergleich gruen.

Co-Authored-By: Claude Fable 5.1 <noreply@anthropic.com>
</commit_message>
<xml_diff>
--- a/docs/upgrade-v4.2/gold/begleiter.docx
+++ b/docs/upgrade-v4.2/gold/begleiter.docx
@@ -6206,7 +6206,7 @@
                 <w:sz w:val="20"/>
                 <w:szCs w:val="20"/>
               </w:rPr>
-              <w:t xml:space="preserve">Medien: Kurzeintrag der Pflichtquelle mit QR</w:t>
+              <w:t xml:space="preserve">Medien: Kurzeintrag der Quelle (QR auf S. 3)</w:t>
             </w:r>
           </w:p>
         </w:tc>
@@ -6455,7 +6455,7 @@
                 <w:sz w:val="20"/>
                 <w:szCs w:val="20"/>
               </w:rPr>
-              <w:t xml:space="preserve">LF3: Pflichtquelle (Medien) oder Lehrmittel-Abschnitt mit Beispielzeile (ohne)</w:t>
+              <w:t xml:space="preserve">LF3: Quelle (Medien) oder Lehrmittel-Abschnitt mit Beispielzeile (ohne)</w:t>
             </w:r>
           </w:p>
         </w:tc>
@@ -7890,7 +7890,7 @@
                 <w:sz w:val="20"/>
                 <w:szCs w:val="20"/>
               </w:rPr>
-              <w:t xml:space="preserve">Pflichtquelle: Artikel (nau.ch / Keystone-SDA); Raster ohne Beispielzeile</w:t>
+              <w:t xml:space="preserve">Quelle: Artikel (nau.ch / Keystone-SDA); Raster ohne Beispielzeile</w:t>
             </w:r>
           </w:p>
         </w:tc>
@@ -7915,7 +7915,7 @@
                 <w:sz w:val="20"/>
                 <w:szCs w:val="20"/>
               </w:rPr>
-              <w:t xml:space="preserve">Pflichtquelle: Statistik 2025 der Schuldenberatung Schweiz, Seite 7 (PDF); Raster ohne Beispielzeile</w:t>
+              <w:t xml:space="preserve">Quelle: Statistik 2025 der Schuldenberatung Schweiz, Seite 7 (PDF); Raster ohne Beispielzeile</w:t>
             </w:r>
           </w:p>
         </w:tc>
@@ -8397,10 +8397,10 @@
           <w:b/>
           <w:bCs/>
         </w:rPr>
-        <w:t xml:space="preserve">Pflichtquelle</w:t>
-      </w:r>
-      <w:r>
-        <w:t xml:space="preserve">: Kurzeintrag mit QR auf S. 1, Quellenkarte mit Auftrag und Raster auf S. 3, </w:t>
+        <w:t xml:space="preserve">Quelle</w:t>
+      </w:r>
+      <w:r>
+        <w:t xml:space="preserve">: Kurzeintrag auf S. 1, Quellenkarte mit QR-Code, Auftrag und Raster auf S. 3, </w:t>
       </w:r>
       <w:r>
         <w:rPr>
@@ -8709,7 +8709,7 @@
         <w:t xml:space="preserve">Geräte:</w:t>
       </w:r>
       <w:r>
-        <w:t xml:space="preserve"> Die Lernenden brauchen ein Gerät mit Internetzugang, auf dem sie die QR-Seite öffnen. Die Pflichtquellen sind ein Artikel (Heft A) und ein PDF, davon nur Seite 7 (Heft B), beide ohne Ton. Der Link öffnet das PDF auf Seite 7, manche Handys zeigen trotzdem Seite 1 — sag die Seitenzahl an.</w:t>
+        <w:t xml:space="preserve"> Die Lernenden brauchen ein Gerät mit Internetzugang, auf dem sie die QR-Seite öffnen. Die Quellen sind ein Artikel (Heft A) und ein PDF, davon nur Seite 7 (Heft B), beide ohne Ton. Der Link öffnet das PDF auf Seite 7, manche Handys zeigen trotzdem Seite 1 — sag die Seitenzahl an.</w:t>
       </w:r>
     </w:p>
     <w:p>
@@ -8810,7 +8810,7 @@
                 <w:b/>
                 <w:bCs/>
               </w:rPr>
-              <w:t xml:space="preserve">Pflichtquelle</w:t>
+              <w:t xml:space="preserve">Quelle</w:t>
             </w:r>
             <w:r>
               <w:t xml:space="preserve"> aus, tritt die </w:t>
@@ -10523,7 +10523,7 @@
         <w:t xml:space="preserve">S. 1 — Herausforderung (8 Min.).</w:t>
       </w:r>
       <w:r>
-        <w:t xml:space="preserve"> Die Lernenden markieren beim Lesen, was offen ist. Genau diese Fragen hakt der Quer-Check auf S. 8 wieder ab — lass sie darum nicht überspringen. In der Medien-Spur steht hier der Kurzeintrag der Pflichtquelle mit QR.</w:t>
+        <w:t xml:space="preserve"> Die Lernenden markieren beim Lesen, was offen ist. Genau diese Fragen hakt der Quer-Check auf S. 8 wieder ab — lass sie darum nicht überspringen. In der Medien-Spur steht hier der Kurzeintrag der Quelle; der QR-Code steht auf S. 3, wo sie gebraucht wird.</w:t>
       </w:r>
     </w:p>
     <w:p>
@@ -10692,7 +10692,7 @@
         <w:t xml:space="preserve">Spur mit Medien:</w:t>
       </w:r>
       <w:r>
-        <w:t xml:space="preserve"> Pflichtquelle ist ein Agenturartikel (421 Wörter) über eine Studie mit 10- bis 17-Jährigen. Das Raster fragt nach Absatz, Kernaussage, Beleg oder Zahl und dem Begriff aus LF1.</w:t>
+        <w:t xml:space="preserve"> Quelle ist ein Agenturartikel (421 Wörter) über eine Studie mit 10- bis 17-Jährigen. Das Raster fragt nach Absatz, Kernaussage, Beleg oder Zahl und dem Begriff aus LF1.</w:t>
       </w:r>
     </w:p>
     <w:p>
@@ -10869,7 +10869,7 @@
         <w:t xml:space="preserve">neutrales</w:t>
       </w:r>
       <w:r>
-        <w:t xml:space="preserve"> Beispiel (Vereinssport, mit Beispielwert) — so wirkt es nicht wie ein Befund aus der Pflichtquelle.</w:t>
+        <w:t xml:space="preserve"> Beispiel (Vereinssport, mit Beispielwert) — so wirkt es nicht wie ein Befund aus der Quelle.</w:t>
       </w:r>
     </w:p>
     <w:p>
@@ -11113,7 +11113,7 @@
               <w:spacing w:after="100" w:before="60" w:line="320"/>
             </w:pPr>
             <w:r>
-              <w:t xml:space="preserve">Die Studie hinter der Pflichtquelle stammt aus Deutschland und befragte 10- bis 17-Jährige. Die Wege, über die Kaufwünsche entstehen, lassen sich übertragen, die Prozentzahlen nicht.</w:t>
+              <w:t xml:space="preserve">Die Studie hinter der Quelle stammt aus Deutschland und befragte 10- bis 17-Jährige. Die Wege, über die Kaufwünsche entstehen, lassen sich übertragen, die Prozentzahlen nicht.</w:t>
             </w:r>
           </w:p>
         </w:tc>
@@ -12181,7 +12181,7 @@
                 <w:i/>
                 <w:iCs/>
               </w:rPr>
-              <w:t xml:space="preserve">(Pflichtquelle, Abs. 2–6)</w:t>
+              <w:t xml:space="preserve">(Quelle, Abs. 2–6)</w:t>
             </w:r>
           </w:p>
           <w:p>
@@ -12209,7 +12209,7 @@
                 <w:i/>
                 <w:iCs/>
               </w:rPr>
-              <w:t xml:space="preserve">(Pflichtquelle, Abs. 1, 5, 7)</w:t>
+              <w:t xml:space="preserve">(Quelle, Abs. 1, 5, 7)</w:t>
             </w:r>
           </w:p>
           <w:p>
@@ -12307,7 +12307,7 @@
                 <w:i/>
                 <w:iCs/>
               </w:rPr>
-              <w:t xml:space="preserve">(Pflichtquelle, Abs. 2, 8)</w:t>
+              <w:t xml:space="preserve">(Quelle, Abs. 2, 8)</w:t>
             </w:r>
           </w:p>
           <w:p>
@@ -15427,7 +15427,7 @@
         <w:t xml:space="preserve">S. 1 — Herausforderung (8 Min.).</w:t>
       </w:r>
       <w:r>
-        <w:t xml:space="preserve"> Die Zahlen sind nachrechenbar: Die Abos ergeben 45 + 20 + 65 = 130 Franken, die offene Rechnung 180 Franken plus 20 Franken Mahngebühr = 200 Franken. Offene Fragen markieren lassen — der Quer-Check auf S. 8 nimmt sie wieder auf. In der Medien-Spur steht hier der Kurzeintrag der Pflichtquelle mit QR: die Statistik 2025 der Schuldenberatung Schweiz, Seite 7.</w:t>
+        <w:t xml:space="preserve"> Die Zahlen sind nachrechenbar: Die Abos ergeben 45 + 20 + 65 = 130 Franken, die offene Rechnung 180 Franken plus 20 Franken Mahngebühr = 200 Franken. Offene Fragen markieren lassen — der Quer-Check auf S. 8 nimmt sie wieder auf. In der Medien-Spur steht hier der Kurzeintrag der Quelle mit QR: die Statistik 2025 der Schuldenberatung Schweiz, Seite 7.</w:t>
       </w:r>
     </w:p>
     <w:p>
@@ -15596,7 +15596,7 @@
         <w:t xml:space="preserve">Spur mit Medien:</w:t>
       </w:r>
       <w:r>
-        <w:t xml:space="preserve"> Pflichtquelle ist die Statistik 2025 der Schuldenberatung Schweiz, </w:t>
+        <w:t xml:space="preserve"> Quelle ist die Statistik 2025 der Schuldenberatung Schweiz, </w:t>
       </w:r>
       <w:r>
         <w:rPr>
@@ -18425,7 +18425,7 @@
                 <w:sz w:val="20"/>
                 <w:szCs w:val="20"/>
               </w:rPr>
-              <w:t xml:space="preserve">A · Pflicht (q-131a-pflicht)</w:t>
+              <w:t xml:space="preserve">A · Quelle (q-131a-pflicht)</w:t>
             </w:r>
           </w:p>
         </w:tc>
@@ -18586,7 +18586,7 @@
             <w:pPr>
               <w:spacing w:after="0" w:before="0"/>
             </w:pPr>
-            <w:hyperlink w:history="1" r:id="rId42sl-bbqer-zr8qgbdy1s">
+            <w:hyperlink w:history="1" r:id="rIdv0v_qf2fngg74vufm_cm5">
               <w:r>
                 <w:rPr>
                   <w:b w:val="false"/>
@@ -18624,7 +18624,7 @@
                 <w:sz w:val="20"/>
                 <w:szCs w:val="20"/>
               </w:rPr>
-              <w:t xml:space="preserve">A · Ersatz zur Pflicht (q-131a-pflicht-ersatz)</w:t>
+              <w:t xml:space="preserve">A · Ersatzquelle (q-131a-pflicht-ersatz)</w:t>
             </w:r>
           </w:p>
         </w:tc>
@@ -18792,7 +18792,7 @@
             <w:pPr>
               <w:spacing w:after="0" w:before="0"/>
             </w:pPr>
-            <w:hyperlink w:history="1" r:id="rIdlqsmgukcideggclnicrd9">
+            <w:hyperlink w:history="1" r:id="rIdgdsypic7mqd57kgljwyc6">
               <w:r>
                 <w:rPr>
                   <w:b w:val="false"/>
@@ -18990,7 +18990,7 @@
             <w:pPr>
               <w:spacing w:after="0" w:before="0"/>
             </w:pPr>
-            <w:hyperlink w:history="1" r:id="rIdqlbzpsjj8z92qv0qlhtrq">
+            <w:hyperlink w:history="1" r:id="rIdydbbyymkvtrsixmxibnhp">
               <w:r>
                 <w:rPr>
                   <w:b w:val="false"/>
@@ -19196,7 +19196,7 @@
             <w:pPr>
               <w:spacing w:after="0" w:before="0"/>
             </w:pPr>
-            <w:hyperlink w:history="1" r:id="rIdrpw3049mqwmyr1aicx6hh">
+            <w:hyperlink w:history="1" r:id="rId8ko60qkvcanwjphtybftx">
               <w:r>
                 <w:rPr>
                   <w:b w:val="false"/>
@@ -19233,7 +19233,7 @@
                 <w:sz w:val="20"/>
                 <w:szCs w:val="20"/>
               </w:rPr>
-              <w:t xml:space="preserve">B · Pflicht (q-131b-pflicht)</w:t>
+              <w:t xml:space="preserve">B · Quelle (q-131b-pflicht)</w:t>
             </w:r>
           </w:p>
         </w:tc>
@@ -19394,7 +19394,7 @@
             <w:pPr>
               <w:spacing w:after="0" w:before="0"/>
             </w:pPr>
-            <w:hyperlink w:history="1" r:id="rIdnjgy9gyqdojkdpx7bg915">
+            <w:hyperlink w:history="1" r:id="rId21ljmoou3-giv_qjuhunc">
               <w:r>
                 <w:rPr>
                   <w:b w:val="false"/>
@@ -19432,7 +19432,7 @@
                 <w:sz w:val="20"/>
                 <w:szCs w:val="20"/>
               </w:rPr>
-              <w:t xml:space="preserve">B · Ersatz zur Pflicht (q-131b-pflicht-ersatz)</w:t>
+              <w:t xml:space="preserve">B · Ersatzquelle (q-131b-pflicht-ersatz)</w:t>
             </w:r>
           </w:p>
         </w:tc>
@@ -19600,7 +19600,7 @@
             <w:pPr>
               <w:spacing w:after="0" w:before="0"/>
             </w:pPr>
-            <w:hyperlink w:history="1" r:id="rIdj242wu7o0hjsu9ggfl4tj">
+            <w:hyperlink w:history="1" r:id="rIdnvocdvmsxxzwywsxado_z">
               <w:r>
                 <w:rPr>
                   <w:b w:val="false"/>
@@ -19798,7 +19798,7 @@
             <w:pPr>
               <w:spacing w:after="0" w:before="0"/>
             </w:pPr>
-            <w:hyperlink w:history="1" r:id="rIdjl2xwsneihtalmfgplrui">
+            <w:hyperlink w:history="1" r:id="rIdfout8cqrjhfrljbpnqqiv">
               <w:r>
                 <w:rPr>
                   <w:b w:val="false"/>
@@ -20004,7 +20004,7 @@
             <w:pPr>
               <w:spacing w:after="0" w:before="0"/>
             </w:pPr>
-            <w:hyperlink w:history="1" r:id="rIdsv_gglchavw8gw-nnkhy3">
+            <w:hyperlink w:history="1" r:id="rIdvg5v49_dk8gltuzolajfr">
               <w:r>
                 <w:rPr>
                   <w:b w:val="false"/>
@@ -20070,7 +20070,7 @@
           <w:b/>
           <w:bCs/>
         </w:rPr>
-        <w:t xml:space="preserve">Pflichtquelle A</w:t>
+        <w:t xml:space="preserve">Quelle A</w:t>
       </w:r>
       <w:r>
         <w:t xml:space="preserve"> beruht auf einer Erhebung in </w:t>
@@ -20143,7 +20143,7 @@
           <w:b/>
           <w:bCs/>
         </w:rPr>
-        <w:t xml:space="preserve">Pflichtquelle B</w:t>
+        <w:t xml:space="preserve">Quelle B</w:t>
       </w:r>
       <w:r>
         <w:t xml:space="preserve"> gilt nur mit ihrer </w:t>
@@ -20375,7 +20375,7 @@
               <w:t xml:space="preserve">halbjährlich</w:t>
             </w:r>
             <w:r>
-              <w:t xml:space="preserve"> und vor jedem Einsatz der Medien-Spur. Fällt eine Pflichtquelle dauerhaft aus, wird die Karte in der Quellenkartei ersetzt und die Lösung zu LF3 neu geschrieben — die Tabelle hier zieht dann von selbst nach.</w:t>
+              <w:t xml:space="preserve"> und vor jedem Einsatz der Medien-Spur. Fällt eine Quelle dauerhaft aus, wird die Karte in der Quellenkartei ersetzt und die Lösung zu LF3 neu geschrieben — die Tabelle hier zieht dann von selbst nach.</w:t>
             </w:r>
           </w:p>
         </w:tc>

</xml_diff>

<commit_message>
v4.2: Dokument «Loesungen» je Heft und Spur fuer die Lehrperson (E19)
- Loesungen zu jedem Feld des Hefts als Daten: ausgefuelltes Raster und
  Befund (LF3), Denkhilfe, Erwartungen zu den Vertiefungen, Abschluss
  (Verbindungen im Begriffsnetz, leere Knoten, Transfer, Quer-Check,
  «Das nehme ich mit»)
- Neues Dokument loesungen-<a|b>-<spur> in HTML und Word, je 5 Seiten,
  Loesungen in Gruen; ersetzt das Loesungsblatt aus E17
- Arbeitsansicht, ZIP, Uebersicht und Export fuehren das Dokument
- check-v42: Regel ERR_V42_LOESUNG verlangt die Loesungsfelder
- Begleiter, ENTSCHEIDE E19, Bericht und Gold-Exporte nachgefuehrt

Co-Authored-By: Claude Fable 5.1 <noreply@anthropic.com>
</commit_message>
<xml_diff>
--- a/docs/upgrade-v4.2/gold/begleiter.docx
+++ b/docs/upgrade-v4.2/gold/begleiter.docx
@@ -461,6 +461,17 @@
               <w:t xml:space="preserve">, nicht an die Lernenden.
 Die Lernenden erhalten Heft A und Heft B (je acht Seiten, in der Spur ohne oder mit
 Medien), den Auftragsbogen zum gemeinsamen Auftrag (vier Seiten) und das KN-Blatt.
+Zu jedem Heft gibt es je Spur ein Dokument </w:t>
+            </w:r>
+            <w:r>
+              <w:rPr>
+                <w:b/>
+                <w:bCs/>
+              </w:rPr>
+              <w:t xml:space="preserve">«Lösungen»</w:t>
+            </w:r>
+            <w:r>
+              <w:t xml:space="preserve"> (nur für dich): eine mögliche Lösung zu jedem Feld des Hefts, in Grün — Leitfragen, ausgefülltes Raster mit Befund, Denkhilfe bzw. Vertiefungen, Produkt und Abschluss.
 Hier steht, </w:t>
             </w:r>
             <w:r>
@@ -11030,17 +11041,17 @@
         <w:t xml:space="preserve">an einem anderen Fall</w:t>
       </w:r>
       <w:r>
-        <w:t xml:space="preserve"> (Spielkonsole). Sie zeigt die Form — Felder, Einträge im Muster Gut → Bedürfnis, Legende mit drei Zeichen, Massstab und Entscheid am Rand —, nicht die Lösung zum eigenen Fall. Die mögliche Lösung zum Fall des Hefts liegt als </w:t>
+        <w:t xml:space="preserve"> (Spielkonsole). Sie zeigt die Form — Felder, Einträge im Muster Gut → Bedürfnis, Legende mit drei Zeichen, Massstab und Entscheid am Rand —, nicht die Lösung zum eigenen Fall. Die mögliche Lösung zum Fall des Hefts steht im Dokument </w:t>
       </w:r>
       <w:r>
         <w:rPr>
           <w:b/>
           <w:bCs/>
         </w:rPr>
-        <w:t xml:space="preserve">Lösungsblatt</w:t>
-      </w:r>
-      <w:r>
-        <w:t xml:space="preserve"> bei den Unterlagen der Lehrperson; zeig sie erst, wenn die eigene Karte steht.</w:t>
+        <w:t xml:space="preserve">«Lösungen»</w:t>
+      </w:r>
+      <w:r>
+        <w:t xml:space="preserve"> bei deinen Unterlagen; zeig sie erst, wenn die eigene Karte steht.</w:t>
       </w:r>
     </w:p>
     <w:p>
@@ -17504,7 +17515,7 @@
                 <w:i/>
                 <w:iCs/>
               </w:rPr>
-              <w:t xml:space="preserve">(q-131b-pflicht, S. 7)</w:t>
+              <w:t xml:space="preserve">(Quelle, S. 7)</w:t>
             </w:r>
           </w:p>
           <w:p>
@@ -17532,7 +17543,7 @@
                 <w:i/>
                 <w:iCs/>
               </w:rPr>
-              <w:t xml:space="preserve">(q-131b-pflicht, S. 7)</w:t>
+              <w:t xml:space="preserve">(Quelle, S. 7)</w:t>
             </w:r>
           </w:p>
           <w:p>
@@ -17630,7 +17641,7 @@
                 <w:i/>
                 <w:iCs/>
               </w:rPr>
-              <w:t xml:space="preserve">(q-131b-pflicht-ersatz)</w:t>
+              <w:t xml:space="preserve">(Ersatzquelle)</w:t>
             </w:r>
           </w:p>
           <w:p>
@@ -18995,7 +19006,7 @@
             <w:pPr>
               <w:spacing w:after="0" w:before="0"/>
             </w:pPr>
-            <w:hyperlink w:history="1" r:id="rIdubjp-rovqfpjclht2_5kl">
+            <w:hyperlink w:history="1" r:id="rIdrlhpzhtoamhhn5j9aqwik">
               <w:r>
                 <w:rPr>
                   <w:b w:val="false"/>
@@ -19201,7 +19212,7 @@
             <w:pPr>
               <w:spacing w:after="0" w:before="0"/>
             </w:pPr>
-            <w:hyperlink w:history="1" r:id="rIddmkpvpipibvcmffye6ggv">
+            <w:hyperlink w:history="1" r:id="rIdmb56vbo0j3etyl4ipdruu">
               <w:r>
                 <w:rPr>
                   <w:b w:val="false"/>
@@ -19399,7 +19410,7 @@
             <w:pPr>
               <w:spacing w:after="0" w:before="0"/>
             </w:pPr>
-            <w:hyperlink w:history="1" r:id="rIdda9erlr_fgazrylqc9yns">
+            <w:hyperlink w:history="1" r:id="rIdedlkqryuhwo74cwm1tnsx">
               <w:r>
                 <w:rPr>
                   <w:b w:val="false"/>
@@ -19605,7 +19616,7 @@
             <w:pPr>
               <w:spacing w:after="0" w:before="0"/>
             </w:pPr>
-            <w:hyperlink w:history="1" r:id="rIdl9dj23ff-0g2wvbhnws7s">
+            <w:hyperlink w:history="1" r:id="rIdcdfyahyzx-wreb6ke1b0p">
               <w:r>
                 <w:rPr>
                   <w:b w:val="false"/>
@@ -19803,7 +19814,7 @@
             <w:pPr>
               <w:spacing w:after="0" w:before="0"/>
             </w:pPr>
-            <w:hyperlink w:history="1" r:id="rIdeaxkgoiynhmjwvuf_hop3">
+            <w:hyperlink w:history="1" r:id="rId1pcaai4aoszgaxhsazfob">
               <w:r>
                 <w:rPr>
                   <w:b w:val="false"/>
@@ -20009,7 +20020,7 @@
             <w:pPr>
               <w:spacing w:after="0" w:before="0"/>
             </w:pPr>
-            <w:hyperlink w:history="1" r:id="rId4v2b4cmf7jyrdlrl_0-vw">
+            <w:hyperlink w:history="1" r:id="rIditdzr9l9w-lodigv3x86c">
               <w:r>
                 <w:rPr>
                   <w:b w:val="false"/>
@@ -20207,7 +20218,7 @@
             <w:pPr>
               <w:spacing w:after="0" w:before="0"/>
             </w:pPr>
-            <w:hyperlink w:history="1" r:id="rId3ev079th8lynzb1legz18">
+            <w:hyperlink w:history="1" r:id="rIdcruz6w7vhn8c31o2ouwif">
               <w:r>
                 <w:rPr>
                   <w:b w:val="false"/>
@@ -20413,7 +20424,7 @@
             <w:pPr>
               <w:spacing w:after="0" w:before="0"/>
             </w:pPr>
-            <w:hyperlink w:history="1" r:id="rIdj0ibgi7imboq35dvrkpun">
+            <w:hyperlink w:history="1" r:id="rIdwwdjzouyuelrylz6btafg">
               <w:r>
                 <w:rPr>
                   <w:b w:val="false"/>

</xml_diff>